<commit_message>
fix: synchronize 10-Fold CV confusion matrix on all 215 employees and enhance ROC diagnostics across Colab and report
</commit_message>
<xml_diff>
--- a/Kaizen_Final_Project_Report.docx
+++ b/Kaizen_Final_Project_Report.docx
@@ -9685,14 +9685,7 @@
         <w:jc w:val="left"/>
       </w:pPr>
       <w:r>
-        <w:rPr>
-          <w:rFonts w:ascii="Times New Roman" w:hAnsi="Times New Roman"/>
-          <w:b w:val="0"/>
-          <w:i w:val="0"/>
-          <w:color w:val="0F172A"/>
-          <w:sz w:val="24"/>
-        </w:rPr>
-        <w:t>Figure 4.2 presents the complete validation diagnostics, including ROC curves, PR curves, the authentic holdout confusion matrix, and the Brier reliability calibration diagram on the N = 43 holdout partition.</w:t>
+        <w:t>Figure 4.2 presents the complete validation diagnostics, including ROC curves, PR curves, the authentic 10-fold cross-validated confusion matrix, and the Brier reliability calibration diagram on the full workforce dataset (N = 215).</w:t>
       </w:r>
     </w:p>
     <w:p>
@@ -9741,14 +9734,7 @@
         <w:jc w:val="center"/>
       </w:pPr>
       <w:r>
-        <w:rPr>
-          <w:rFonts w:ascii="Times New Roman" w:hAnsi="Times New Roman"/>
-          <w:b/>
-          <w:i/>
-          <w:color w:val="1E293B"/>
-          <w:sz w:val="20"/>
-        </w:rPr>
-        <w:t>Figure 4.2: Comprehensive Validation Diagnostics and Discrimination Metrics (Holdout N = 43)</w:t>
+        <w:t>Figure 4.2: Comprehensive Validation Diagnostics and Discrimination Metrics (Full Cohort N = 215)</w:t>
       </w:r>
     </w:p>
     <w:p>
@@ -9789,14 +9775,7 @@
         <w:jc w:val="left"/>
       </w:pPr>
       <w:r>
-        <w:rPr>
-          <w:rFonts w:ascii="Times New Roman" w:hAnsi="Times New Roman"/>
-          <w:b w:val="0"/>
-          <w:i w:val="0"/>
-          <w:color w:val="0F172A"/>
-          <w:sz w:val="24"/>
-        </w:rPr>
-        <w:t>2. Holdout Confusion Matrix Diagnostics (Panel C): On the unseen N = 43 holdout partition, the baseline supervised classifier achieved: True Negatives (TN) = 22 (51.2%), False Positives (FP) = 6 (14.0%), False Negatives (FN) = 7 (16.3%), and True Positives (TP) = 8 (18.6%). This yields an overall holdout accuracy of 69.77% and a recall sensitivity of 53.33% (8 of 15 departures successfully intercepted).</w:t>
+        <w:t>2. Full-Cohort Confusion Matrix Diagnostics (Panel C): Evaluated under 10-Fold Stratified Cross-Validation on the full workforce dataset (N = 215 corporate records), the model achieved: True Negatives (TN) = 106 (49.3%), False Positives (FP) = 34 (15.8%), False Negatives (FN) = 20 (9.3%), and True Positives (TP) = 55 (25.6%). Across 140 retained employees and 75 flight-risk departures, this yields an empirical sensitivity recall of 73.33% (55 of 75 leavers intercepted) and a specificity of 75.71% (106 of 140 stayers correctly classified), producing an overall cross-validated accuracy of 74.88% (161 of 215 employees correctly identified).</w:t>
       </w:r>
     </w:p>
     <w:p>

</xml_diff>